<commit_message>
111486|single_source__single_source_07-20|1784540985082-GlobalLink Translations for SS
</commit_message>
<xml_diff>
--- a/Test/language/de/AT_de-DE.docx
+++ b/Test/language/de/AT_de-DE.docx
@@ -1,7 +1,7 @@
 
 <file path=word/document.xml><?xml version="1.0" encoding="utf-8"?>
 <w:document xmlns:ve="http://schemas.openxmlformats.org/markup-compatibility/2006" xmlns:o="urn:schemas-microsoft-com:office:office" xmlns:r="http://schemas.openxmlformats.org/officeDocument/2006/relationships" xmlns:m="http://schemas.openxmlformats.org/officeDocument/2006/math" xmlns:v="urn:schemas-microsoft-com:vml" xmlns:wp="http://schemas.openxmlformats.org/drawingml/2006/wordprocessingDrawing" xmlns:w10="urn:schemas-microsoft-com:office:word" xmlns:w="http://schemas.openxmlformats.org/wordprocessingml/2006/main" xmlns:wne="http://schemas.microsoft.com/office/word/2006/wordml">
-  <!-- Generated by Aspose.Words for Java 24.3.0 -->
+  <!-- Generated by Aspose.Words for Java 25.11.0 -->
   <w:body>
     <w:p>
       <w:pPr>
@@ -47,7 +47,7 @@
           <w:cs w:val="0"/>
           <w:lang w:val="de-DE" w:eastAsia="en-US" w:bidi="ar-SA"/>
         </w:rPr>
-        <w:t>Tëêts nëêw fîìlëê ááddëêd</w:t>
+        <w:t>Tèèts nèèw fíîlèè ââddèèd</w:t>
       </w:r>
     </w:p>
     <w:sectPr>

</xml_diff>